<commit_message>
Regenerate the user manual for M22
Adds Section 11.7 on where settings and records are stored, with the
upgrade note for anyone coming from a build that kept them beside the
executable. The Settings figure picks up both M22 UI changes: the strategy
picker no longer displays a stale item, and the storage location is named
on screen.

Co-Authored-By: Claude Opus 5 <noreply@anthropic.com>
</commit_message>
<xml_diff>
--- a/docs/Quant_Advisory_Terminal_User_Manual.docx
+++ b/docs/Quant_Advisory_Terminal_User_Manual.docx
@@ -47,7 +47,7 @@
         <w:rPr>
           <w:sz w:val="22"/>
         </w:rPr>
-        <w:t>Version 2.4  |  Milestone M21</w:t>
+        <w:t>Version 2.5  |  Milestone M22</w:t>
       </w:r>
     </w:p>
     <w:p>
@@ -444,6 +444,28 @@
           </w:tcPr>
           <w:p>
             <w:r>
+              <w:t>Stable storage location</w:t>
+            </w:r>
+          </w:p>
+        </w:tc>
+        <w:tc>
+          <w:tcPr>
+            <w:tcW w:type="dxa" w:w="4320"/>
+          </w:tcPr>
+          <w:p>
+            <w:r>
+              <w:t>Settings and records live in one per-user directory instead of beside whatever folder the application was launched from, and are migrated there on first run (Section 11.7).</w:t>
+            </w:r>
+          </w:p>
+        </w:tc>
+      </w:tr>
+      <w:tr>
+        <w:tc>
+          <w:tcPr>
+            <w:tcW w:type="dxa" w:w="4320"/>
+          </w:tcPr>
+          <w:p>
+            <w:r>
               <w:t>Balances panel</w:t>
             </w:r>
           </w:p>
@@ -729,7 +751,7 @@
           </w:tcPr>
           <w:p>
             <w:r>
-              <w:t>Non-secret settings in a .env file written by the Settings screen; API keys and secrets only ever in the Windows Credential Manager, never in .env and never in logs.</w:t>
+              <w:t>One per-user directory - %LOCALAPPDATA%\QuantAdvisoryTerminal - holding a .env of non-secret settings and a data folder of records. API keys are never in either: they live only in the Windows Credential Manager. The Settings screen names the directory. See Section 11.7.</w:t>
             </w:r>
           </w:p>
         </w:tc>
@@ -1140,7 +1162,7 @@
       <w:r>
         <w:drawing>
           <wp:inline xmlns:a="http://schemas.openxmlformats.org/drawingml/2006/main" xmlns:pic="http://schemas.openxmlformats.org/drawingml/2006/picture">
-            <wp:extent cx="5669280" cy="5502745"/>
+            <wp:extent cx="5669280" cy="5598414"/>
             <wp:docPr id="1" name="Picture 1"/>
             <wp:cNvGraphicFramePr>
               <a:graphicFrameLocks noChangeAspect="1"/>
@@ -1161,7 +1183,7 @@
                   <pic:spPr>
                     <a:xfrm>
                       <a:off x="0" y="0"/>
-                      <a:ext cx="5669280" cy="5502745"/>
+                      <a:ext cx="5669280" cy="5598414"/>
                     </a:xfrm>
                     <a:prstGeom prst="rect"/>
                   </pic:spPr>
@@ -1192,7 +1214,7 @@
       <w:r>
         <w:drawing>
           <wp:inline xmlns:a="http://schemas.openxmlformats.org/drawingml/2006/main" xmlns:pic="http://schemas.openxmlformats.org/drawingml/2006/picture">
-            <wp:extent cx="5669280" cy="5502745"/>
+            <wp:extent cx="5669280" cy="5598414"/>
             <wp:docPr id="2" name="Picture 2"/>
             <wp:cNvGraphicFramePr>
               <a:graphicFrameLocks noChangeAspect="1"/>
@@ -1213,7 +1235,7 @@
                   <pic:spPr>
                     <a:xfrm>
                       <a:off x="0" y="0"/>
-                      <a:ext cx="5669280" cy="5502745"/>
+                      <a:ext cx="5669280" cy="5598414"/>
                     </a:xfrm>
                     <a:prstGeom prst="rect"/>
                   </pic:spPr>
@@ -5438,7 +5460,7 @@
       <w:r>
         <w:drawing>
           <wp:inline xmlns:a="http://schemas.openxmlformats.org/drawingml/2006/main" xmlns:pic="http://schemas.openxmlformats.org/drawingml/2006/picture">
-            <wp:extent cx="5669280" cy="5006683"/>
+            <wp:extent cx="5669280" cy="5102352"/>
             <wp:docPr id="11" name="Picture 11"/>
             <wp:cNvGraphicFramePr>
               <a:graphicFrameLocks noChangeAspect="1"/>
@@ -5459,7 +5481,7 @@
                   <pic:spPr>
                     <a:xfrm>
                       <a:off x="0" y="0"/>
-                      <a:ext cx="5669280" cy="5006683"/>
+                      <a:ext cx="5669280" cy="5102352"/>
                     </a:xfrm>
                     <a:prstGeom prst="rect"/>
                   </pic:spPr>
@@ -6564,6 +6586,164 @@
         <w:t>Selecting Auto-trade opens a confirmation dialog that spells out what the rails do and do not do, and whose default button is No, so an accidental Enter keypress declines. While the mode is selected, a red warning panel stays on screen. Section 12.3 documents the rails in full.</w:t>
       </w:r>
     </w:p>
+    <w:p>
+      <w:pPr>
+        <w:pStyle w:val="Heading2"/>
+      </w:pPr>
+      <w:r>
+        <w:t>11.7 Where Settings and Records Are Stored</w:t>
+      </w:r>
+    </w:p>
+    <w:p>
+      <w:r>
+        <w:t>Everything the application owns lives in one per-user directory, named at the bottom of the Settings screen so it is never a guess:</w:t>
+      </w:r>
+    </w:p>
+    <w:tbl>
+      <w:tblPr>
+        <w:tblStyle w:val="LightGrid-Accent1"/>
+        <w:tblW w:type="auto" w:w="0"/>
+        <w:tblLook w:firstColumn="1" w:firstRow="1" w:lastColumn="0" w:lastRow="0" w:noHBand="0" w:noVBand="1" w:val="04A0"/>
+      </w:tblPr>
+      <w:tblGrid>
+        <w:gridCol w:w="4320"/>
+        <w:gridCol w:w="4320"/>
+      </w:tblGrid>
+      <w:tr>
+        <w:tc>
+          <w:tcPr>
+            <w:tcW w:type="dxa" w:w="4320"/>
+          </w:tcPr>
+          <w:p>
+            <w:r/>
+            <w:r>
+              <w:rPr>
+                <w:b/>
+              </w:rPr>
+              <w:t>Location</w:t>
+            </w:r>
+          </w:p>
+        </w:tc>
+        <w:tc>
+          <w:tcPr>
+            <w:tcW w:type="dxa" w:w="4320"/>
+          </w:tcPr>
+          <w:p>
+            <w:r/>
+            <w:r>
+              <w:rPr>
+                <w:b/>
+              </w:rPr>
+              <w:t>Contents</w:t>
+            </w:r>
+          </w:p>
+        </w:tc>
+      </w:tr>
+      <w:tr>
+        <w:tc>
+          <w:tcPr>
+            <w:tcW w:type="dxa" w:w="4320"/>
+          </w:tcPr>
+          <w:p>
+            <w:r>
+              <w:t>%LOCALAPPDATA%\QuantAdvisoryTerminal\.env</w:t>
+            </w:r>
+          </w:p>
+        </w:tc>
+        <w:tc>
+          <w:tcPr>
+            <w:tcW w:type="dxa" w:w="4320"/>
+          </w:tcPr>
+          <w:p>
+            <w:r>
+              <w:t>Every non-secret setting the Settings screen writes.</w:t>
+            </w:r>
+          </w:p>
+        </w:tc>
+      </w:tr>
+      <w:tr>
+        <w:tc>
+          <w:tcPr>
+            <w:tcW w:type="dxa" w:w="4320"/>
+          </w:tcPr>
+          <w:p>
+            <w:r>
+              <w:t>%LOCALAPPDATA%\QuantAdvisoryTerminal\data</w:t>
+            </w:r>
+          </w:p>
+        </w:tc>
+        <w:tc>
+          <w:tcPr>
+            <w:tcW w:type="dxa" w:w="4320"/>
+          </w:tcPr>
+          <w:p>
+            <w:r>
+              <w:t>Trade ledger, equity curve, decision journal, risk decisions, reports, logs and session exports.</w:t>
+            </w:r>
+          </w:p>
+        </w:tc>
+      </w:tr>
+      <w:tr>
+        <w:tc>
+          <w:tcPr>
+            <w:tcW w:type="dxa" w:w="4320"/>
+          </w:tcPr>
+          <w:p>
+            <w:r>
+              <w:t>Windows Credential Manager</w:t>
+            </w:r>
+          </w:p>
+        </w:tc>
+        <w:tc>
+          <w:tcPr>
+            <w:tcW w:type="dxa" w:w="4320"/>
+          </w:tcPr>
+          <w:p>
+            <w:r>
+              <w:t>API keys and secrets. These are never written to .env and never to a log.</w:t>
+            </w:r>
+          </w:p>
+        </w:tc>
+      </w:tr>
+    </w:tbl>
+    <w:p/>
+    <w:p>
+      <w:r>
+        <w:t>The location does not move when the application does, so upgrading to a new build keeps every setting and every record. Setting the QAT_HOME environment variable relocates all of it, which is what a portable installation would do.</w:t>
+      </w:r>
+    </w:p>
+    <w:tbl>
+      <w:tblPr>
+        <w:tblStyle w:val="TableGrid"/>
+        <w:tblW w:type="auto" w:w="0"/>
+        <w:tblLook w:firstColumn="1" w:firstRow="1" w:lastColumn="0" w:lastRow="0" w:noHBand="0" w:noVBand="1" w:val="04A0"/>
+      </w:tblPr>
+      <w:tblGrid>
+        <w:gridCol w:w="8640"/>
+      </w:tblGrid>
+      <w:tr>
+        <w:tc>
+          <w:tcPr>
+            <w:tcW w:type="dxa" w:w="8640"/>
+          </w:tcPr>
+          <w:p>
+            <w:r>
+              <w:rPr>
+                <w:b/>
+                <w:color w:val="1B3A5F"/>
+              </w:rPr>
+              <w:t>Upgrading from an earlier build</w:t>
+            </w:r>
+          </w:p>
+          <w:p>
+            <w:r>
+              <w:t>Earlier versions kept settings and records beside whichever folder the application was started from, so the same installation could read different settings depending on how it was launched. On first run, a .env and a data folder found in the working directory are copied into the new location. They are copied and never moved, an existing file at the destination is never overwritten, and what happened is written to the log. Once you are satisfied the new location has everything, the old folders can be deleted by hand - the application no longer reads them.</w:t>
+            </w:r>
+          </w:p>
+        </w:tc>
+      </w:tr>
+    </w:tbl>
+    <w:p/>
     <w:p>
       <w:r>
         <w:br w:type="page"/>
@@ -8592,6 +8772,38 @@
           <w:p>
             <w:r>
               <w:t>Default out-of-sample window.</w:t>
+            </w:r>
+          </w:p>
+        </w:tc>
+      </w:tr>
+      <w:tr>
+        <w:tc>
+          <w:tcPr>
+            <w:tcW w:type="dxa" w:w="2880"/>
+          </w:tcPr>
+          <w:p>
+            <w:r>
+              <w:t>QAT_HOME</w:t>
+            </w:r>
+          </w:p>
+        </w:tc>
+        <w:tc>
+          <w:tcPr>
+            <w:tcW w:type="dxa" w:w="2880"/>
+          </w:tcPr>
+          <w:p>
+            <w:r>
+              <w:t>(per-user)</w:t>
+            </w:r>
+          </w:p>
+        </w:tc>
+        <w:tc>
+          <w:tcPr>
+            <w:tcW w:type="dxa" w:w="2880"/>
+          </w:tcPr>
+          <w:p>
+            <w:r>
+              <w:t>Relocates settings and records wholesale (Section 11.7).</w:t>
             </w:r>
           </w:p>
         </w:tc>

</xml_diff>

<commit_message>
Correct the manual where M49 changed what is true
Two statements were left wrong by the ledger becoming persistent.

Section 10.5 said the diagnostic columns are written to trades.csv and that the
application "does not read these back". The filename was closed_trades.csv, and
the file is now read at every launch and feeds sizing and the promotion bar. The
diagnostics still decide nothing; the file is no longer passive.

Section 10.3 gains a callout, because the visible behaviour changed: the trade
count is now a running total rather than this session's, positions opened in an
earlier session are restored into the ledger at startup, and a position held
before this application first saw it is named at startup and cannot produce a
closed trade. An operator who previously watched the table reset on every launch
needs to be told which of those is now expected.

Co-Authored-By: Claude Opus 5 <noreply@anthropic.com>
</commit_message>
<xml_diff>
--- a/docs/Quant_Advisory_Terminal_User_Manual.docx
+++ b/docs/Quant_Advisory_Terminal_User_Manual.docx
@@ -58,7 +58,7 @@
         <w:rPr>
           <w:sz w:val="22"/>
         </w:rPr>
-        <w:t>2026-08-03</w:t>
+        <w:t>2026-08-05</w:t>
       </w:r>
     </w:p>
     <w:p/>
@@ -5466,6 +5466,38 @@
       </w:tr>
     </w:tbl>
     <w:p/>
+    <w:tbl>
+      <w:tblPr>
+        <w:tblStyle w:val="TableGrid"/>
+        <w:tblW w:type="auto" w:w="0"/>
+        <w:tblLook w:firstColumn="1" w:firstRow="1" w:lastColumn="0" w:lastRow="0" w:noHBand="0" w:noVBand="1" w:val="04A0"/>
+      </w:tblPr>
+      <w:tblGrid>
+        <w:gridCol w:w="8640"/>
+      </w:tblGrid>
+      <w:tr>
+        <w:tc>
+          <w:tcPr>
+            <w:tcW w:type="dxa" w:w="8640"/>
+          </w:tcPr>
+          <w:p>
+            <w:r>
+              <w:rPr>
+                <w:b/>
+                <w:color w:val="1B3A5F"/>
+              </w:rPr>
+              <w:t>Trade history accumulates across sessions</w:t>
+            </w:r>
+          </w:p>
+          <w:p>
+            <w:r>
+              <w:t>The trade count on this screen is the running total, not this session's. Closed trades are read back from closed_trades.csv at every launch, and positions opened in an earlier session are restored into the ledger at startup from the recorded entry, so a stop firing weeks after the entry still produces a complete trade with its correct entry price, stop and holding period. A position held when this application first met it has no recorded entry, and is named in the log at startup: its eventual exit is still handled correctly at the broker, but it cannot produce a closed trade, because nothing here knows what it cost or when it was opened.</w:t>
+            </w:r>
+          </w:p>
+        </w:tc>
+      </w:tr>
+    </w:tbl>
+    <w:p/>
     <w:p>
       <w:pPr>
         <w:pStyle w:val="Heading2"/>
@@ -6066,7 +6098,7 @@
     <w:p/>
     <w:p>
       <w:r>
-        <w:t>All of it is written to trades.csv alongside the P&amp;L columns. None of it influences any decision - the application does not read these back.</w:t>
+        <w:t>All of it is written to closed_trades.csv alongside the P&amp;L columns, and read back at every launch. None of these diagnostic columns influences a decision - sizing and the promotion bar read the P&amp;L figures, not the excursion ones - but the file as a whole is now load-bearing rather than a passive record.</w:t>
       </w:r>
     </w:p>
     <w:p>

</xml_diff>

<commit_message>
Remove retired Alpaca and US trading paths
</commit_message>
<xml_diff>
--- a/docs/Quant_Advisory_Terminal_User_Manual.docx
+++ b/docs/Quant_Advisory_Terminal_User_Manual.docx
@@ -25,7 +25,7 @@
           <w:color w:val="1B3A5F"/>
           <w:sz w:val="40"/>
         </w:rPr>
-        <w:t>User Manual</w:t>
+        <w:t>Historical User Manual</w:t>
       </w:r>
     </w:p>
     <w:p>
@@ -61,7 +61,19 @@
         <w:t>2026-08-20</w:t>
       </w:r>
     </w:p>
-    <w:p/>
+    <w:p>
+      <w:pPr>
+        <w:jc w:val="center"/>
+      </w:pPr>
+      <w:r>
+        <w:rPr>
+          <w:b/>
+          <w:color w:val="B71C1C"/>
+          <w:sz w:val="20"/>
+        </w:rPr>
+        <w:t>M37 historical reference only. QAT now supports ASX equities through IBKR; US and Alpaca trading instructions below are retired.</w:t>
+      </w:r>
+    </w:p>
     <w:tbl>
       <w:tblPr>
         <w:tblStyle w:val="TableGrid"/>

</xml_diff>